<commit_message>
feat: apply approved challenge review updates
</commit_message>
<xml_diff>
--- a/Mapped Curriculum Lesson - Supplemental Material/Grade 6/Lesson 02 - Operators and Integers/Operators and Integers - Worksheet.docx
+++ b/Mapped Curriculum Lesson - Supplemental Material/Grade 6/Lesson 02 - Operators and Integers/Operators and Integers - Worksheet.docx
@@ -901,7 +901,37 @@
           <w:noProof/>
           <w:color w:val="080808"/>
         </w:rPr>
-        <w:t>Store 2 as a non-zero secret number, divide the user's sum by it, and display the new total.</w:t>
+        <w:t xml:space="preserve">Store 2 in a variable called [divisor]. Divide [total] by [divisor] and store the result in [divided_total]. Display </w:t>
+      </w:r>
+      <w:r>
+        <w:rPr>
+          <w:noProof/>
+          <w:color w:val="067D17"/>
+          <w:rFonts w:ascii="Consolas" w:hAnsi="Consolas"/>
+        </w:rPr>
+        <w:t>"Divided total:"</w:t>
+      </w:r>
+      <w:r>
+        <w:rPr>
+          <w:noProof/>
+          <w:color w:val="080808"/>
+        </w:rPr>
+        <w:t xml:space="preserve"> followed by [divided_total]. Test inputs 8 and 4; the output must include </w:t>
+      </w:r>
+      <w:r>
+        <w:rPr>
+          <w:noProof/>
+          <w:color w:val="067D17"/>
+          <w:rFonts w:ascii="Consolas" w:hAnsi="Consolas"/>
+        </w:rPr>
+        <w:t>"Divided total: 6.0"</w:t>
+      </w:r>
+      <w:r>
+        <w:rPr>
+          <w:noProof/>
+          <w:color w:val="080808"/>
+        </w:rPr>
+        <w:t>.</w:t>
       </w:r>
     </w:p>
     <w:p>

</xml_diff>